<commit_message>
[Docs](Arquitetura) Atualiza definição dos módulos da aplicação
</commit_message>
<xml_diff>
--- a/docs/Arquitetura/Definicao_Modulos_Aplicacao.docx
+++ b/docs/Arquitetura/Definicao_Modulos_Aplicacao.docx
@@ -196,53 +196,15 @@
         <w:rPr>
           <w:rFonts w:eastAsia="Times New Roman" w:cs="Arial"/>
           <w:szCs w:val="24"/>
-          <w:highlight w:val="yellow"/>
-          <w:lang w:eastAsia="pt-BR"/>
-        </w:rPr>
-        <w:t xml:space="preserve">A estrutura também </w:t>
-      </w:r>
-      <w:r>
-        <w:rPr>
-          <w:rFonts w:eastAsia="Times New Roman" w:cs="Arial"/>
-          <w:szCs w:val="24"/>
-          <w:highlight w:val="yellow"/>
-          <w:lang w:eastAsia="pt-BR"/>
-        </w:rPr>
-        <w:t>leva em consideração</w:t>
-      </w:r>
-      <w:r>
-        <w:rPr>
-          <w:rFonts w:eastAsia="Times New Roman" w:cs="Arial"/>
-          <w:szCs w:val="24"/>
-          <w:highlight w:val="yellow"/>
-          <w:lang w:eastAsia="pt-BR"/>
-        </w:rPr>
-        <w:t xml:space="preserve"> a proposta de desenvolvimento de um produto genérico e configurável, que não seja limitado às necessidades da Cr</w:t>
-      </w:r>
-      <w:r>
-        <w:rPr>
-          <w:rFonts w:eastAsia="Times New Roman" w:cs="Arial"/>
-          <w:szCs w:val="24"/>
-          <w:highlight w:val="yellow"/>
-          <w:lang w:eastAsia="pt-BR"/>
-        </w:rPr>
-        <w:t>i</w:t>
-      </w:r>
-      <w:r>
-        <w:rPr>
-          <w:rFonts w:eastAsia="Times New Roman" w:cs="Arial"/>
-          <w:szCs w:val="24"/>
-          <w:highlight w:val="yellow"/>
-          <w:lang w:eastAsia="pt-BR"/>
-        </w:rPr>
-        <w:t xml:space="preserve">stal </w:t>
+          <w:lang w:eastAsia="pt-BR"/>
+        </w:rPr>
+        <w:t xml:space="preserve">A estrutura também leva em consideração a proposta de desenvolvimento de um produto genérico e configurável, que não seja limitado às necessidades da Cristal </w:t>
       </w:r>
       <w:proofErr w:type="spellStart"/>
       <w:r>
         <w:rPr>
           <w:rFonts w:eastAsia="Times New Roman" w:cs="Arial"/>
           <w:szCs w:val="24"/>
-          <w:highlight w:val="yellow"/>
           <w:lang w:eastAsia="pt-BR"/>
         </w:rPr>
         <w:t>Up</w:t>
@@ -252,7 +214,6 @@
         <w:rPr>
           <w:rFonts w:eastAsia="Times New Roman" w:cs="Arial"/>
           <w:szCs w:val="24"/>
-          <w:highlight w:val="yellow"/>
           <w:lang w:eastAsia="pt-BR"/>
         </w:rPr>
         <w:t xml:space="preserve"> Soluções Digitais. Dessa forma, os módulos devem possuir responsabilidades bem definidas e permitir futuras adaptações para diferentes empresas e contextos de utilização.</w:t>
@@ -3001,7 +2962,6 @@
           <w:b/>
           <w:bCs/>
           <w:szCs w:val="24"/>
-          <w:highlight w:val="yellow"/>
           <w:lang w:eastAsia="pt-BR"/>
         </w:rPr>
         <w:t>2.8 Dashboard</w:t>
@@ -3650,23 +3610,7 @@
                 <w:szCs w:val="24"/>
                 <w:lang w:eastAsia="pt-BR"/>
               </w:rPr>
-              <w:t xml:space="preserve">Essencial </w:t>
-            </w:r>
-            <w:r>
-              <w:rPr>
-                <w:rFonts w:eastAsia="Times New Roman" w:cs="Arial"/>
-                <w:szCs w:val="24"/>
-                <w:lang w:eastAsia="pt-BR"/>
-              </w:rPr>
-              <w:t>–</w:t>
-            </w:r>
-            <w:r>
-              <w:rPr>
-                <w:rFonts w:eastAsia="Times New Roman" w:cs="Arial"/>
-                <w:szCs w:val="24"/>
-                <w:lang w:eastAsia="pt-BR"/>
-              </w:rPr>
-              <w:t xml:space="preserve"> MVP</w:t>
+              <w:t>Essencial – MVP</w:t>
             </w:r>
           </w:p>
         </w:tc>
@@ -3717,23 +3661,7 @@
                 <w:szCs w:val="24"/>
                 <w:lang w:eastAsia="pt-BR"/>
               </w:rPr>
-              <w:t xml:space="preserve">Essencial </w:t>
-            </w:r>
-            <w:r>
-              <w:rPr>
-                <w:rFonts w:eastAsia="Times New Roman" w:cs="Arial"/>
-                <w:szCs w:val="24"/>
-                <w:lang w:eastAsia="pt-BR"/>
-              </w:rPr>
-              <w:t>–</w:t>
-            </w:r>
-            <w:r>
-              <w:rPr>
-                <w:rFonts w:eastAsia="Times New Roman" w:cs="Arial"/>
-                <w:szCs w:val="24"/>
-                <w:lang w:eastAsia="pt-BR"/>
-              </w:rPr>
-              <w:t xml:space="preserve"> MVP</w:t>
+              <w:t>Essencial – MVP</w:t>
             </w:r>
           </w:p>
         </w:tc>
@@ -3783,23 +3711,7 @@
                 <w:szCs w:val="24"/>
                 <w:lang w:eastAsia="pt-BR"/>
               </w:rPr>
-              <w:t xml:space="preserve">Essencial </w:t>
-            </w:r>
-            <w:r>
-              <w:rPr>
-                <w:rFonts w:eastAsia="Times New Roman" w:cs="Arial"/>
-                <w:szCs w:val="24"/>
-                <w:lang w:eastAsia="pt-BR"/>
-              </w:rPr>
-              <w:t>–</w:t>
-            </w:r>
-            <w:r>
-              <w:rPr>
-                <w:rFonts w:eastAsia="Times New Roman" w:cs="Arial"/>
-                <w:szCs w:val="24"/>
-                <w:lang w:eastAsia="pt-BR"/>
-              </w:rPr>
-              <w:t xml:space="preserve"> MVP</w:t>
+              <w:t>Essencial – MVP</w:t>
             </w:r>
           </w:p>
         </w:tc>
@@ -3849,23 +3761,7 @@
                 <w:szCs w:val="24"/>
                 <w:lang w:eastAsia="pt-BR"/>
               </w:rPr>
-              <w:t xml:space="preserve">Essencial </w:t>
-            </w:r>
-            <w:r>
-              <w:rPr>
-                <w:rFonts w:eastAsia="Times New Roman" w:cs="Arial"/>
-                <w:szCs w:val="24"/>
-                <w:lang w:eastAsia="pt-BR"/>
-              </w:rPr>
-              <w:t>–</w:t>
-            </w:r>
-            <w:r>
-              <w:rPr>
-                <w:rFonts w:eastAsia="Times New Roman" w:cs="Arial"/>
-                <w:szCs w:val="24"/>
-                <w:lang w:eastAsia="pt-BR"/>
-              </w:rPr>
-              <w:t xml:space="preserve"> MVP</w:t>
+              <w:t>Essencial – MVP</w:t>
             </w:r>
           </w:p>
         </w:tc>
@@ -4341,8 +4237,38 @@
           <w:b w:val="0"/>
           <w:bCs w:val="0"/>
         </w:rPr>
-        <w:t>TAREFA</w:t>
-      </w:r>
+        <w:t>TAREFAS</w:t>
+      </w:r>
+      <w:r>
+        <w:rPr>
+          <w:rFonts w:ascii="Arial" w:hAnsi="Arial" w:cs="Arial"/>
+        </w:rPr>
+        <w:t>.</w:t>
+      </w:r>
+      <w:r>
+        <w:rPr>
+          <w:rFonts w:ascii="Arial" w:hAnsi="Arial" w:cs="Arial"/>
+        </w:rPr>
+        <w:t xml:space="preserve"> </w:t>
+      </w:r>
+      <w:r>
+        <w:rPr>
+          <w:rFonts w:ascii="Arial" w:hAnsi="Arial" w:cs="Arial"/>
+        </w:rPr>
+        <w:t>Dessa forma, o fluxo principal do sistema pode ser representado da seguinte maneira:</w:t>
+      </w:r>
+    </w:p>
+    <w:p>
+      <w:pPr>
+        <w:pStyle w:val="NormalWeb"/>
+        <w:spacing w:line="360" w:lineRule="auto"/>
+        <w:jc w:val="both"/>
+        <w:rPr>
+          <w:rFonts w:ascii="Arial" w:hAnsi="Arial" w:cs="Arial"/>
+          <w:b/>
+          <w:bCs/>
+        </w:rPr>
+      </w:pPr>
       <w:r>
         <w:rPr>
           <w:rStyle w:val="Forte"/>
@@ -4350,55 +4276,7 @@
           <w:b w:val="0"/>
           <w:bCs w:val="0"/>
         </w:rPr>
-        <w:t>S</w:t>
-      </w:r>
-      <w:r>
-        <w:rPr>
-          <w:rFonts w:ascii="Arial" w:hAnsi="Arial" w:cs="Arial"/>
-        </w:rPr>
-        <w:t>.</w:t>
-      </w:r>
-      <w:r>
-        <w:rPr>
-          <w:rFonts w:ascii="Arial" w:hAnsi="Arial" w:cs="Arial"/>
-        </w:rPr>
-        <w:t xml:space="preserve"> </w:t>
-      </w:r>
-      <w:r>
-        <w:rPr>
-          <w:rFonts w:ascii="Arial" w:hAnsi="Arial" w:cs="Arial"/>
-        </w:rPr>
-        <w:t>Dessa forma, o fluxo principal do sistema pode ser representado da seguinte maneira:</w:t>
-      </w:r>
-    </w:p>
-    <w:p>
-      <w:pPr>
-        <w:pStyle w:val="NormalWeb"/>
-        <w:spacing w:line="360" w:lineRule="auto"/>
-        <w:jc w:val="both"/>
-        <w:rPr>
-          <w:rFonts w:ascii="Arial" w:hAnsi="Arial" w:cs="Arial"/>
-          <w:b/>
-          <w:bCs/>
-        </w:rPr>
-      </w:pPr>
-      <w:r>
-        <w:rPr>
-          <w:rStyle w:val="Forte"/>
-          <w:rFonts w:ascii="Arial" w:hAnsi="Arial" w:cs="Arial"/>
-          <w:b w:val="0"/>
-          <w:bCs w:val="0"/>
-        </w:rPr>
-        <w:t>Autenticação e Acesso → Funil Comercial → CLIENTE → PROJETO → QUADRO → COLUNA → TAREFA</w:t>
-      </w:r>
-      <w:r>
-        <w:rPr>
-          <w:rStyle w:val="Forte"/>
-          <w:rFonts w:ascii="Arial" w:hAnsi="Arial" w:cs="Arial"/>
-          <w:b w:val="0"/>
-          <w:bCs w:val="0"/>
-        </w:rPr>
-        <w:t>S</w:t>
+        <w:t>Autenticação e Acesso → Funil Comercial → CLIENTE → PROJETO → QUADRO → COLUNA → TAREFAS</w:t>
       </w:r>
     </w:p>
     <w:p>

</xml_diff>